<commit_message>
Update project documentation and submission file with optimization changes and corrected answers
</commit_message>
<xml_diff>
--- a/Project 3 write up.docx
+++ b/Project 3 write up.docx
@@ -7,15 +7,316 @@
         <w:t>Project 3 write up</w:t>
       </w:r>
     </w:p>
+    <w:p>
+      <w:pPr>
+        <w:rPr>
+          <w:b/>
+          <w:bCs/>
+        </w:rPr>
+      </w:pPr>
+      <w:r>
+        <w:rPr>
+          <w:b/>
+          <w:bCs/>
+        </w:rPr>
+        <w:t>Changes</w:t>
+      </w:r>
+      <w:r>
+        <w:rPr>
+          <w:b/>
+          <w:bCs/>
+        </w:rPr>
+        <w:t xml:space="preserve"> Q9</w:t>
+      </w:r>
+      <w:r>
+        <w:rPr>
+          <w:b/>
+          <w:bCs/>
+        </w:rPr>
+        <w:t>8</w:t>
+      </w:r>
+    </w:p>
+    <w:p>
+      <w:pPr>
+        <w:pStyle w:val="ListParagraph"/>
+        <w:numPr>
+          <w:ilvl w:val="0"/>
+          <w:numId w:val="1"/>
+        </w:numPr>
+      </w:pPr>
+      <w:r>
+        <w:t xml:space="preserve">I </w:t>
+      </w:r>
+      <w:r>
+        <w:t>kept the optimized truss as two pins. This would allow us to not need a third column. With that, I removed all the zero force members. Th</w:t>
+      </w:r>
+      <w:r>
+        <w:t xml:space="preserve">is decreases material cost. Zero force members are needed when the bottom chord goes into compression. That can happen if there is a lot of uplift, but due to the loading on this truss, </w:t>
+      </w:r>
+      <w:r>
+        <w:t xml:space="preserve">does not happen. </w:t>
+      </w:r>
+      <w:proofErr w:type="gramStart"/>
+      <w:r>
+        <w:t>So</w:t>
+      </w:r>
+      <w:proofErr w:type="gramEnd"/>
+      <w:r>
+        <w:t xml:space="preserve"> because the bottom chord is in tension only, </w:t>
+      </w:r>
+      <w:proofErr w:type="gramStart"/>
+      <w:r>
+        <w:t>the zero</w:t>
+      </w:r>
+      <w:proofErr w:type="gramEnd"/>
+      <w:r>
+        <w:t xml:space="preserve"> force members are not needed</w:t>
+      </w:r>
+    </w:p>
+    <w:p>
+      <w:pPr>
+        <w:pStyle w:val="ListParagraph"/>
+        <w:numPr>
+          <w:ilvl w:val="0"/>
+          <w:numId w:val="1"/>
+        </w:numPr>
+      </w:pPr>
+      <w:r>
+        <w:t>I changed the</w:t>
+      </w:r>
+      <w:r>
+        <w:t xml:space="preserve"> size of W flange used. I ran an optimization program (with the help of AI to write it), that iterated through all W flange options and found t</w:t>
+      </w:r>
+      <w:r>
+        <w:t>he W flange with the smallest cross section that</w:t>
+      </w:r>
+      <w:r>
+        <w:t xml:space="preserve"> did not fail under any of the 4 requirements.  You could do this with other sections, but I decided to keep it to W flange for consistency, which would allow connections to be easier. </w:t>
+      </w:r>
+      <w:r>
+        <w:t xml:space="preserve">This would decrease the material cost of truss because it uses the smallest feasible cross section. </w:t>
+      </w:r>
+    </w:p>
+    <w:p>
+      <w:r>
+        <w:pict w14:anchorId="28B414CB">
+          <v:rect id="_x0000_i1026" style="width:0;height:1.5pt" o:hralign="center" o:hrstd="t" o:hr="t" fillcolor="#a0a0a0" stroked="f"/>
+        </w:pict>
+      </w:r>
+    </w:p>
+    <w:p>
+      <w:pPr>
+        <w:rPr>
+          <w:b/>
+          <w:bCs/>
+        </w:rPr>
+      </w:pPr>
+      <w:r>
+        <w:rPr>
+          <w:b/>
+          <w:bCs/>
+        </w:rPr>
+        <w:t xml:space="preserve">Differences in 6 </w:t>
+      </w:r>
+      <w:r>
+        <w:rPr>
+          <w:b/>
+          <w:bCs/>
+        </w:rPr>
+        <w:t>scenarios</w:t>
+      </w:r>
+      <w:r>
+        <w:rPr>
+          <w:b/>
+          <w:bCs/>
+        </w:rPr>
+        <w:t xml:space="preserve"> Q93</w:t>
+      </w:r>
+    </w:p>
+    <w:p>
+      <w:r>
+        <w:t>Displacements:</w:t>
+      </w:r>
+      <w:r>
+        <w:t xml:space="preserve"> </w:t>
+      </w:r>
+      <w:r>
+        <w:t>The more supports are added, the less</w:t>
+      </w:r>
+      <w:r>
+        <w:t xml:space="preserve"> displacement happens. There is also less displacement when the wind loads are added due to the uplift, and therefore overall decrease in loading. </w:t>
+      </w:r>
+    </w:p>
+    <w:p>
+      <w:r>
+        <w:t>Reactions:</w:t>
+      </w:r>
+      <w:r>
+        <w:t xml:space="preserve"> Without </w:t>
+      </w:r>
+      <w:r>
+        <w:t>wind</w:t>
+      </w:r>
+      <w:r>
+        <w:t xml:space="preserve"> loads</w:t>
+      </w:r>
+      <w:r>
+        <w:t xml:space="preserve">, </w:t>
+      </w:r>
+      <w:r>
+        <w:t xml:space="preserve">the simply </w:t>
+      </w:r>
+      <w:r>
+        <w:t>support</w:t>
+      </w:r>
+      <w:r>
+        <w:t>ed</w:t>
+      </w:r>
+      <w:r>
+        <w:t xml:space="preserve"> and two pins </w:t>
+      </w:r>
+      <w:r>
+        <w:t xml:space="preserve">have </w:t>
+      </w:r>
+      <w:r>
+        <w:t xml:space="preserve">the same reactions. Adding in a third pin in the middle, the outer pins have similar reactions to each other, but the </w:t>
+      </w:r>
+      <w:r>
+        <w:t xml:space="preserve">middle pin has a larger reaction. </w:t>
+      </w:r>
+      <w:r>
+        <w:t xml:space="preserve">When introducing wind, the reactions are less due to the </w:t>
+      </w:r>
+      <w:r>
+        <w:t xml:space="preserve">uplift. Reactions on the windward side of the truss are larger due to the smaller amount of uplift on the windward side. </w:t>
+      </w:r>
+    </w:p>
+    <w:p>
+      <w:r>
+        <w:t>Axial Loads:</w:t>
+      </w:r>
+      <w:r>
+        <w:t xml:space="preserve"> The </w:t>
+      </w:r>
+      <w:proofErr w:type="gramStart"/>
+      <w:r>
+        <w:t>simply</w:t>
+      </w:r>
+      <w:proofErr w:type="gramEnd"/>
+      <w:r>
+        <w:t xml:space="preserve"> supported and pin trusses have the same axial loads, while the pin in the middle allows the column in the middle of the truss to take load (No long a </w:t>
+      </w:r>
+      <w:r>
+        <w:t>zero-force</w:t>
+      </w:r>
+      <w:r>
+        <w:t xml:space="preserve"> member)</w:t>
+      </w:r>
+      <w:r>
+        <w:t xml:space="preserve">. This means that there </w:t>
+      </w:r>
+      <w:proofErr w:type="gramStart"/>
+      <w:r>
+        <w:t>is</w:t>
+      </w:r>
+      <w:proofErr w:type="gramEnd"/>
+      <w:r>
+        <w:t xml:space="preserve"> </w:t>
+      </w:r>
+      <w:proofErr w:type="gramStart"/>
+      <w:r>
+        <w:t>less</w:t>
+      </w:r>
+      <w:proofErr w:type="gramEnd"/>
+      <w:r>
+        <w:t xml:space="preserve"> axial loads on other members. Because of</w:t>
+      </w:r>
+      <w:r>
+        <w:t xml:space="preserve"> uplift from the wind, the axial loads with wind are less. </w:t>
+      </w:r>
+      <w:r>
+        <w:t>The larger leeward uplift leads to more axial loads in the windward side than in the leeward side</w:t>
+      </w:r>
+    </w:p>
+    <w:p>
+      <w:r>
+        <w:t xml:space="preserve">Symmetry: </w:t>
+      </w:r>
+      <w:r>
+        <w:t>Without the wind loads, the trusses are largely symmetric</w:t>
+      </w:r>
+      <w:r>
+        <w:t xml:space="preserve"> in both displacement and stress</w:t>
+      </w:r>
+      <w:r>
+        <w:t>, although there simply supported truss does elongate a little in the x direction</w:t>
+      </w:r>
+      <w:r>
+        <w:t xml:space="preserve">. The wind loads provide a different story. Because of higher </w:t>
+      </w:r>
+      <w:r>
+        <w:t>uplifts</w:t>
+      </w:r>
+      <w:r>
+        <w:t xml:space="preserve"> on the leeward side of the truss, total forces on that side are less than on the windward side. </w:t>
+      </w:r>
+      <w:r>
+        <w:t xml:space="preserve">This means that the windward side has higher stresses in the members. </w:t>
+      </w:r>
+    </w:p>
     <w:p/>
     <w:p>
       <w:r>
+        <w:pict w14:anchorId="3686F263">
+          <v:rect id="_x0000_i1025" style="width:0;height:1.5pt" o:hralign="center" o:hrstd="t" o:hr="t" fillcolor="#a0a0a0" stroked="f"/>
+        </w:pict>
+      </w:r>
+    </w:p>
+    <w:p>
+      <w:pPr>
+        <w:rPr>
+          <w:b/>
+          <w:bCs/>
+        </w:rPr>
+      </w:pPr>
+      <w:r>
+        <w:rPr>
+          <w:b/>
+          <w:bCs/>
+        </w:rPr>
+        <w:t>Python Script Overviews</w:t>
+      </w:r>
+      <w:r>
+        <w:rPr>
+          <w:b/>
+          <w:bCs/>
+        </w:rPr>
+        <w:t xml:space="preserve"> </w:t>
+      </w:r>
+      <w:r>
+        <w:rPr>
+          <w:b/>
+          <w:bCs/>
+        </w:rPr>
+        <w:t>Q71-77</w:t>
+      </w:r>
+    </w:p>
+    <w:p>
+      <w:r>
         <w:t>Main Trusses.py</w:t>
       </w:r>
     </w:p>
     <w:p>
       <w:r>
-        <w:t>-Is the main function to run. Does everything from loading the data to solving for the stiffness matrix and stresses. No internal functions, though it does call other functions</w:t>
+        <w:t xml:space="preserve">-Is the main function to run. Does everything from loading the data to </w:t>
+      </w:r>
+      <w:proofErr w:type="gramStart"/>
+      <w:r>
+        <w:t>solving for</w:t>
+      </w:r>
+      <w:proofErr w:type="gramEnd"/>
+      <w:r>
+        <w:t xml:space="preserve"> the stiffness matrix and stresses. No internal functions, though it does call other functions</w:t>
       </w:r>
     </w:p>
     <w:p/>
@@ -75,7 +376,23 @@
     </w:p>
     <w:p>
       <w:r>
-        <w:t>-This file has functions that solve for the displacement and external reactions. There are functions I need to fill out to solve for internal loads, stresses, and buckling</w:t>
+        <w:t xml:space="preserve">-This file has functions that </w:t>
+      </w:r>
+      <w:proofErr w:type="gramStart"/>
+      <w:r>
+        <w:t>solve for the</w:t>
+      </w:r>
+      <w:proofErr w:type="gramEnd"/>
+      <w:r>
+        <w:t xml:space="preserve"> displacement and external reactions. There are functions I need to fill out to </w:t>
+      </w:r>
+      <w:proofErr w:type="gramStart"/>
+      <w:r>
+        <w:t>solve for</w:t>
+      </w:r>
+      <w:proofErr w:type="gramEnd"/>
+      <w:r>
+        <w:t xml:space="preserve"> internal loads, stresses, and buckling</w:t>
       </w:r>
     </w:p>
     <w:p/>
@@ -111,7 +428,15 @@
         <w:t xml:space="preserve">information in the csv file and converts it to </w:t>
       </w:r>
       <w:r>
-        <w:t>material properties. The first function gets the modulus of elasticity and the second function gets the area and moment of inertia</w:t>
+        <w:t xml:space="preserve">material properties. The first function gets the modulus of </w:t>
+      </w:r>
+      <w:proofErr w:type="gramStart"/>
+      <w:r>
+        <w:t>elasticity</w:t>
+      </w:r>
+      <w:proofErr w:type="gramEnd"/>
+      <w:r>
+        <w:t xml:space="preserve"> and the second function gets the area and moment of inertia</w:t>
       </w:r>
     </w:p>
     <w:sectPr>
@@ -122,6 +447,103 @@
     </w:sectPr>
   </w:body>
 </w:document>
+</file>
+
+<file path=word/numbering.xml><?xml version="1.0" encoding="utf-8"?>
+<w:numbering xmlns:wpc="http://schemas.microsoft.com/office/word/2010/wordprocessingCanvas" xmlns:cx="http://schemas.microsoft.com/office/drawing/2014/chartex" xmlns:cx1="http://schemas.microsoft.com/office/drawing/2015/9/8/chartex" xmlns:cx2="http://schemas.microsoft.com/office/drawing/2015/10/21/chartex" xmlns:cx3="http://schemas.microsoft.com/office/drawing/2016/5/9/chartex" xmlns:cx4="http://schemas.microsoft.com/office/drawing/2016/5/10/chartex" xmlns:cx5="http://schemas.microsoft.com/office/drawing/2016/5/11/chartex" xmlns:cx6="http://schemas.microsoft.com/office/drawing/2016/5/12/chartex" xmlns:cx7="http://schemas.microsoft.com/office/drawing/2016/5/13/chartex" xmlns:cx8="http://schemas.microsoft.com/office/drawing/2016/5/14/chartex" xmlns:mc="http://schemas.openxmlformats.org/markup-compatibility/2006" xmlns:aink="http://schemas.microsoft.com/office/drawing/2016/ink" xmlns:am3d="http://schemas.microsoft.com/office/drawing/2017/model3d" xmlns:o="urn:schemas-microsoft-com:office:office" xmlns:oel="http://schemas.microsoft.com/office/2019/extlst" xmlns:r="http://schemas.openxmlformats.org/officeDocument/2006/relationships" xmlns:m="http://schemas.openxmlformats.org/officeDocument/2006/math" xmlns:v="urn:schemas-microsoft-com:vml" xmlns:wp14="http://schemas.microsoft.com/office/word/2010/wordprocessingDrawing" xmlns:wp="http://schemas.openxmlformats.org/drawingml/2006/wordprocessingDrawing" xmlns:w10="urn:schemas-microsoft-com:office:word" xmlns:w="http://schemas.openxmlformats.org/wordprocessingml/2006/main" xmlns:w14="http://schemas.microsoft.com/office/word/2010/wordml" xmlns:w15="http://schemas.microsoft.com/office/word/2012/wordml" xmlns:w16cex="http://schemas.microsoft.com/office/word/2018/wordml/cex" xmlns:w16cid="http://schemas.microsoft.com/office/word/2016/wordml/cid" xmlns:w16="http://schemas.microsoft.com/office/word/2018/wordml" xmlns:w16du="http://schemas.microsoft.com/office/word/2023/wordml/word16du" xmlns:w16sdtdh="http://schemas.microsoft.com/office/word/2020/wordml/sdtdatahash" xmlns:w16sdtfl="http://schemas.microsoft.com/office/word/2024/wordml/sdtformatlock" xmlns:w16se="http://schemas.microsoft.com/office/word/2015/wordml/symex" xmlns:wpg="http://schemas.microsoft.com/office/word/2010/wordprocessingGroup" xmlns:wpi="http://schemas.microsoft.com/office/word/2010/wordprocessingInk" xmlns:wne="http://schemas.microsoft.com/office/word/2006/wordml" xmlns:wps="http://schemas.microsoft.com/office/word/2010/wordprocessingShape" mc:Ignorable="w14 w15 w16se w16cid w16 w16cex w16sdtdh w16sdtfl w16du wp14">
+  <w:abstractNum w:abstractNumId="0" w15:restartNumberingAfterBreak="0">
+    <w:nsid w:val="428351A2"/>
+    <w:multiLevelType w:val="hybridMultilevel"/>
+    <w:tmpl w:val="72080674"/>
+    <w:lvl w:ilvl="0" w:tplc="0409000F">
+      <w:start w:val="1"/>
+      <w:numFmt w:val="decimal"/>
+      <w:lvlText w:val="%1."/>
+      <w:lvlJc w:val="left"/>
+      <w:pPr>
+        <w:ind w:left="720" w:hanging="360"/>
+      </w:pPr>
+      <w:rPr>
+        <w:rFonts w:hint="default"/>
+      </w:rPr>
+    </w:lvl>
+    <w:lvl w:ilvl="1" w:tplc="04090019" w:tentative="1">
+      <w:start w:val="1"/>
+      <w:numFmt w:val="lowerLetter"/>
+      <w:lvlText w:val="%2."/>
+      <w:lvlJc w:val="left"/>
+      <w:pPr>
+        <w:ind w:left="1440" w:hanging="360"/>
+      </w:pPr>
+    </w:lvl>
+    <w:lvl w:ilvl="2" w:tplc="0409001B" w:tentative="1">
+      <w:start w:val="1"/>
+      <w:numFmt w:val="lowerRoman"/>
+      <w:lvlText w:val="%3."/>
+      <w:lvlJc w:val="right"/>
+      <w:pPr>
+        <w:ind w:left="2160" w:hanging="180"/>
+      </w:pPr>
+    </w:lvl>
+    <w:lvl w:ilvl="3" w:tplc="0409000F" w:tentative="1">
+      <w:start w:val="1"/>
+      <w:numFmt w:val="decimal"/>
+      <w:lvlText w:val="%4."/>
+      <w:lvlJc w:val="left"/>
+      <w:pPr>
+        <w:ind w:left="2880" w:hanging="360"/>
+      </w:pPr>
+    </w:lvl>
+    <w:lvl w:ilvl="4" w:tplc="04090019" w:tentative="1">
+      <w:start w:val="1"/>
+      <w:numFmt w:val="lowerLetter"/>
+      <w:lvlText w:val="%5."/>
+      <w:lvlJc w:val="left"/>
+      <w:pPr>
+        <w:ind w:left="3600" w:hanging="360"/>
+      </w:pPr>
+    </w:lvl>
+    <w:lvl w:ilvl="5" w:tplc="0409001B" w:tentative="1">
+      <w:start w:val="1"/>
+      <w:numFmt w:val="lowerRoman"/>
+      <w:lvlText w:val="%6."/>
+      <w:lvlJc w:val="right"/>
+      <w:pPr>
+        <w:ind w:left="4320" w:hanging="180"/>
+      </w:pPr>
+    </w:lvl>
+    <w:lvl w:ilvl="6" w:tplc="0409000F" w:tentative="1">
+      <w:start w:val="1"/>
+      <w:numFmt w:val="decimal"/>
+      <w:lvlText w:val="%7."/>
+      <w:lvlJc w:val="left"/>
+      <w:pPr>
+        <w:ind w:left="5040" w:hanging="360"/>
+      </w:pPr>
+    </w:lvl>
+    <w:lvl w:ilvl="7" w:tplc="04090019" w:tentative="1">
+      <w:start w:val="1"/>
+      <w:numFmt w:val="lowerLetter"/>
+      <w:lvlText w:val="%8."/>
+      <w:lvlJc w:val="left"/>
+      <w:pPr>
+        <w:ind w:left="5760" w:hanging="360"/>
+      </w:pPr>
+    </w:lvl>
+    <w:lvl w:ilvl="8" w:tplc="0409001B" w:tentative="1">
+      <w:start w:val="1"/>
+      <w:numFmt w:val="lowerRoman"/>
+      <w:lvlText w:val="%9."/>
+      <w:lvlJc w:val="right"/>
+      <w:pPr>
+        <w:ind w:left="6480" w:hanging="180"/>
+      </w:pPr>
+    </w:lvl>
+  </w:abstractNum>
+  <w:num w:numId="1" w16cid:durableId="1654915823">
+    <w:abstractNumId w:val="0"/>
+  </w:num>
+</w:numbering>
 </file>
 
 <file path=word/styles.xml><?xml version="1.0" encoding="utf-8"?>

</xml_diff>